<commit_message>
Update Student Information System document
</commit_message>
<xml_diff>
--- a/Student Information System/Student Information System.docx
+++ b/Student Information System/Student Information System.docx
@@ -2560,6 +2560,81 @@
     <w:p>
       <w:pPr>
         <w:rPr>
+          <w:rFonts w:ascii="Times New Roman" w:hAnsi="Times New Roman" w:cs="Times New Roman"/>
+          <w:b/>
+          <w:bCs/>
+        </w:rPr>
+      </w:pPr>
+      <w:r>
+        <w:rPr>
+          <w:rFonts w:ascii="Times New Roman" w:hAnsi="Times New Roman" w:cs="Times New Roman"/>
+          <w:b/>
+          <w:bCs/>
+        </w:rPr>
+        <w:br w:type="page"/>
+      </w:r>
+      <w:r>
+        <w:rPr>
+          <w:rFonts w:ascii="Times New Roman" w:hAnsi="Times New Roman" w:cs="Times New Roman"/>
+          <w:b/>
+          <w:bCs/>
+          <w:noProof/>
+        </w:rPr>
+        <w:lastRenderedPageBreak/>
+        <w:drawing>
+          <wp:inline distT="0" distB="0" distL="0" distR="0">
+            <wp:extent cx="8453443" cy="5496544"/>
+            <wp:effectExtent l="5397" t="0" r="0" b="0"/>
+            <wp:docPr id="486805212" name="Picture 1"/>
+            <wp:cNvGraphicFramePr>
+              <a:graphicFrameLocks xmlns:a="http://schemas.openxmlformats.org/drawingml/2006/main" noChangeAspect="1"/>
+            </wp:cNvGraphicFramePr>
+            <a:graphic xmlns:a="http://schemas.openxmlformats.org/drawingml/2006/main">
+              <a:graphicData uri="http://schemas.openxmlformats.org/drawingml/2006/picture">
+                <pic:pic xmlns:pic="http://schemas.openxmlformats.org/drawingml/2006/picture">
+                  <pic:nvPicPr>
+                    <pic:cNvPr id="486805212" name="Picture 486805212"/>
+                    <pic:cNvPicPr/>
+                  </pic:nvPicPr>
+                  <pic:blipFill>
+                    <a:blip r:embed="rId8">
+                      <a:extLst>
+                        <a:ext uri="{28A0092B-C50C-407E-A947-70E740481C1C}">
+                          <a14:useLocalDpi xmlns:a14="http://schemas.microsoft.com/office/drawing/2010/main" val="0"/>
+                        </a:ext>
+                      </a:extLst>
+                    </a:blip>
+                    <a:stretch>
+                      <a:fillRect/>
+                    </a:stretch>
+                  </pic:blipFill>
+                  <pic:spPr>
+                    <a:xfrm rot="16200000">
+                      <a:off x="0" y="0"/>
+                      <a:ext cx="8501319" cy="5527674"/>
+                    </a:xfrm>
+                    <a:prstGeom prst="rect">
+                      <a:avLst/>
+                    </a:prstGeom>
+                  </pic:spPr>
+                </pic:pic>
+              </a:graphicData>
+            </a:graphic>
+          </wp:inline>
+        </w:drawing>
+      </w:r>
+      <w:r>
+        <w:rPr>
+          <w:rFonts w:ascii="Times New Roman" w:hAnsi="Times New Roman" w:cs="Times New Roman"/>
+          <w:b/>
+          <w:bCs/>
+        </w:rPr>
+        <w:br w:type="page"/>
+      </w:r>
+    </w:p>
+    <w:p>
+      <w:pPr>
+        <w:rPr>
           <w:rFonts w:ascii="Times New Roman" w:eastAsiaTheme="majorEastAsia" w:hAnsi="Times New Roman" w:cs="Times New Roman"/>
           <w:b/>
           <w:bCs/>
@@ -2568,30 +2643,21 @@
           <w:szCs w:val="32"/>
         </w:rPr>
       </w:pPr>
+    </w:p>
+    <w:p>
+      <w:pPr>
+        <w:pStyle w:val="Heading2"/>
+        <w:jc w:val="both"/>
+        <w:rPr>
+          <w:rFonts w:ascii="Times New Roman" w:hAnsi="Times New Roman" w:cs="Times New Roman"/>
+        </w:rPr>
+      </w:pPr>
       <w:r>
         <w:rPr>
           <w:rFonts w:ascii="Times New Roman" w:hAnsi="Times New Roman" w:cs="Times New Roman"/>
           <w:b/>
           <w:bCs/>
         </w:rPr>
-        <w:br w:type="page"/>
-      </w:r>
-    </w:p>
-    <w:p>
-      <w:pPr>
-        <w:pStyle w:val="Heading2"/>
-        <w:jc w:val="both"/>
-        <w:rPr>
-          <w:rFonts w:ascii="Times New Roman" w:hAnsi="Times New Roman" w:cs="Times New Roman"/>
-        </w:rPr>
-      </w:pPr>
-      <w:r>
-        <w:rPr>
-          <w:rFonts w:ascii="Times New Roman" w:hAnsi="Times New Roman" w:cs="Times New Roman"/>
-          <w:b/>
-          <w:bCs/>
-        </w:rPr>
-        <w:lastRenderedPageBreak/>
         <w:t>8. Advantages</w:t>
       </w:r>
     </w:p>

</xml_diff>